<commit_message>
Modifications made to Lab 2 placeholder.dox that were not added in the last commit and push
</commit_message>
<xml_diff>
--- a/Lab 2 placeholder.docx
+++ b/Lab 2 placeholder.docx
@@ -4,7 +4,15 @@
   <w:body>
     <w:p>
       <w:r>
-        <w:t xml:space="preserve">Created the folder ArchOSC Assignment inside the Workspace folder. Created the Pictures folder and Lab 2 placeholder word </w:t>
+        <w:t xml:space="preserve">Created the folder </w:t>
+      </w:r>
+      <w:proofErr w:type="spellStart"/>
+      <w:r>
+        <w:t>ArchOSC</w:t>
+      </w:r>
+      <w:proofErr w:type="spellEnd"/>
+      <w:r>
+        <w:t xml:space="preserve"> Assignment inside the Workspace folder. Created the Pictures folder and Lab 2 placeholder word </w:t>
       </w:r>
       <w:r>
         <w:rPr>
@@ -13,7 +21,23 @@
         <w:t>document</w:t>
       </w:r>
       <w:r>
-        <w:t xml:space="preserve"> inside of the ArchOSC Assighnment folder. Took a screenshot of the </w:t>
+        <w:t xml:space="preserve"> inside of the </w:t>
+      </w:r>
+      <w:proofErr w:type="spellStart"/>
+      <w:r>
+        <w:t>ArchOSC</w:t>
+      </w:r>
+      <w:proofErr w:type="spellEnd"/>
+      <w:r>
+        <w:t xml:space="preserve"> </w:t>
+      </w:r>
+      <w:proofErr w:type="spellStart"/>
+      <w:r>
+        <w:t>Assighnment</w:t>
+      </w:r>
+      <w:proofErr w:type="spellEnd"/>
+      <w:r>
+        <w:t xml:space="preserve"> folder. Took a screenshot of the </w:t>
       </w:r>
       <w:r>
         <w:rPr>
@@ -22,7 +46,15 @@
         <w:t>condense</w:t>
       </w:r>
       <w:r>
-        <w:t xml:space="preserve"> of the ArchOSC Assignment folder and saved it as screenshot 1 inside the pictures folder.</w:t>
+        <w:t xml:space="preserve"> of the </w:t>
+      </w:r>
+      <w:proofErr w:type="spellStart"/>
+      <w:r>
+        <w:t>ArchOSC</w:t>
+      </w:r>
+      <w:proofErr w:type="spellEnd"/>
+      <w:r>
+        <w:t xml:space="preserve"> Assignment folder and saved it as screenshot 1 inside the pictures folder.</w:t>
       </w:r>
     </w:p>
     <w:p>
@@ -76,7 +108,23 @@
     <w:p/>
     <w:p>
       <w:r>
-        <w:t>Opened the terminal within the ArchOSC Assignment folder and used the git init command to initialise a local repository using this folder.</w:t>
+        <w:t xml:space="preserve">Opened the terminal within the </w:t>
+      </w:r>
+      <w:proofErr w:type="spellStart"/>
+      <w:r>
+        <w:t>ArchOSC</w:t>
+      </w:r>
+      <w:proofErr w:type="spellEnd"/>
+      <w:r>
+        <w:t xml:space="preserve"> Assignment folder and used the git </w:t>
+      </w:r>
+      <w:proofErr w:type="spellStart"/>
+      <w:r>
+        <w:t>init</w:t>
+      </w:r>
+      <w:proofErr w:type="spellEnd"/>
+      <w:r>
+        <w:t xml:space="preserve"> command to initialise a local repository using this folder.</w:t>
       </w:r>
     </w:p>
     <w:p>
@@ -131,7 +179,23 @@
     <w:p>
       <w:r>
         <w:lastRenderedPageBreak/>
-        <w:t>Created a GitHub repository in the GitHub website with the name ArchOSC-Assignment-AndrewBell.</w:t>
+        <w:t xml:space="preserve">Created a GitHub repository in the GitHub website with the name </w:t>
+      </w:r>
+      <w:proofErr w:type="spellStart"/>
+      <w:r>
+        <w:t>ArchOSC</w:t>
+      </w:r>
+      <w:proofErr w:type="spellEnd"/>
+      <w:r>
+        <w:t>-Assignment-</w:t>
+      </w:r>
+      <w:proofErr w:type="spellStart"/>
+      <w:r>
+        <w:t>AndrewBell</w:t>
+      </w:r>
+      <w:proofErr w:type="spellEnd"/>
+      <w:r>
+        <w:t>.</w:t>
       </w:r>
     </w:p>
     <w:p>
@@ -225,6 +289,382 @@
                   </pic:nvPicPr>
                   <pic:blipFill>
                     <a:blip r:embed="rId7" cstate="print">
+                      <a:extLst>
+                        <a:ext uri="{28A0092B-C50C-407E-A947-70E740481C1C}">
+                          <a14:useLocalDpi xmlns:a14="http://schemas.microsoft.com/office/drawing/2010/main" val="0"/>
+                        </a:ext>
+                      </a:extLst>
+                    </a:blip>
+                    <a:stretch>
+                      <a:fillRect/>
+                    </a:stretch>
+                  </pic:blipFill>
+                  <pic:spPr>
+                    <a:xfrm>
+                      <a:off x="0" y="0"/>
+                      <a:ext cx="5731510" cy="3223895"/>
+                    </a:xfrm>
+                    <a:prstGeom prst="rect">
+                      <a:avLst/>
+                    </a:prstGeom>
+                  </pic:spPr>
+                </pic:pic>
+              </a:graphicData>
+            </a:graphic>
+          </wp:inline>
+        </w:drawing>
+      </w:r>
+    </w:p>
+    <w:p/>
+    <w:p>
+      <w:r>
+        <w:lastRenderedPageBreak/>
+        <w:t xml:space="preserve">Created the file index.html inside the </w:t>
+      </w:r>
+      <w:proofErr w:type="spellStart"/>
+      <w:r>
+        <w:t>ArchOSC</w:t>
+      </w:r>
+      <w:proofErr w:type="spellEnd"/>
+      <w:r>
+        <w:t xml:space="preserve"> Assignment folder and wrote html code to produce the web page pictured below.</w:t>
+      </w:r>
+    </w:p>
+    <w:p>
+      <w:r>
+        <w:rPr>
+          <w:noProof/>
+        </w:rPr>
+        <w:drawing>
+          <wp:inline distT="0" distB="0" distL="0" distR="0" wp14:anchorId="028AD84B" wp14:editId="6E384E43">
+            <wp:extent cx="5731510" cy="3223895"/>
+            <wp:effectExtent l="0" t="0" r="2540" b="0"/>
+            <wp:docPr id="1499418240" name="Picture 5"/>
+            <wp:cNvGraphicFramePr>
+              <a:graphicFrameLocks xmlns:a="http://schemas.openxmlformats.org/drawingml/2006/main" noChangeAspect="1"/>
+            </wp:cNvGraphicFramePr>
+            <a:graphic xmlns:a="http://schemas.openxmlformats.org/drawingml/2006/main">
+              <a:graphicData uri="http://schemas.openxmlformats.org/drawingml/2006/picture">
+                <pic:pic xmlns:pic="http://schemas.openxmlformats.org/drawingml/2006/picture">
+                  <pic:nvPicPr>
+                    <pic:cNvPr id="1499418240" name="Picture 1499418240"/>
+                    <pic:cNvPicPr/>
+                  </pic:nvPicPr>
+                  <pic:blipFill>
+                    <a:blip r:embed="rId8" cstate="print">
+                      <a:extLst>
+                        <a:ext uri="{28A0092B-C50C-407E-A947-70E740481C1C}">
+                          <a14:useLocalDpi xmlns:a14="http://schemas.microsoft.com/office/drawing/2010/main" val="0"/>
+                        </a:ext>
+                      </a:extLst>
+                    </a:blip>
+                    <a:stretch>
+                      <a:fillRect/>
+                    </a:stretch>
+                  </pic:blipFill>
+                  <pic:spPr>
+                    <a:xfrm>
+                      <a:off x="0" y="0"/>
+                      <a:ext cx="5731510" cy="3223895"/>
+                    </a:xfrm>
+                    <a:prstGeom prst="rect">
+                      <a:avLst/>
+                    </a:prstGeom>
+                  </pic:spPr>
+                </pic:pic>
+              </a:graphicData>
+            </a:graphic>
+          </wp:inline>
+        </w:drawing>
+      </w:r>
+    </w:p>
+    <w:p/>
+    <w:p>
+      <w:r>
+        <w:t xml:space="preserve">Used the terminal commands git status, git </w:t>
+      </w:r>
+      <w:proofErr w:type="gramStart"/>
+      <w:r>
+        <w:t>add .</w:t>
+      </w:r>
+      <w:proofErr w:type="gramEnd"/>
+      <w:r>
+        <w:t xml:space="preserve"> and git commit -m to check the status of the local repository compared to the GitHub repository, add all </w:t>
+      </w:r>
+      <w:proofErr w:type="spellStart"/>
+      <w:r>
+        <w:t>non added</w:t>
+      </w:r>
+      <w:proofErr w:type="spellEnd"/>
+      <w:r>
+        <w:t xml:space="preserve"> files to be pushed to the GitHub repository from the local repository and committed the added files with a commit message.</w:t>
+      </w:r>
+    </w:p>
+    <w:p>
+      <w:r>
+        <w:rPr>
+          <w:noProof/>
+        </w:rPr>
+        <w:drawing>
+          <wp:inline distT="0" distB="0" distL="0" distR="0" wp14:anchorId="0776C84F" wp14:editId="5D505777">
+            <wp:extent cx="5731510" cy="3223895"/>
+            <wp:effectExtent l="0" t="0" r="2540" b="0"/>
+            <wp:docPr id="995729640" name="Picture 6"/>
+            <wp:cNvGraphicFramePr>
+              <a:graphicFrameLocks xmlns:a="http://schemas.openxmlformats.org/drawingml/2006/main" noChangeAspect="1"/>
+            </wp:cNvGraphicFramePr>
+            <a:graphic xmlns:a="http://schemas.openxmlformats.org/drawingml/2006/main">
+              <a:graphicData uri="http://schemas.openxmlformats.org/drawingml/2006/picture">
+                <pic:pic xmlns:pic="http://schemas.openxmlformats.org/drawingml/2006/picture">
+                  <pic:nvPicPr>
+                    <pic:cNvPr id="995729640" name="Picture 995729640"/>
+                    <pic:cNvPicPr/>
+                  </pic:nvPicPr>
+                  <pic:blipFill>
+                    <a:blip r:embed="rId9" cstate="print">
+                      <a:extLst>
+                        <a:ext uri="{28A0092B-C50C-407E-A947-70E740481C1C}">
+                          <a14:useLocalDpi xmlns:a14="http://schemas.microsoft.com/office/drawing/2010/main" val="0"/>
+                        </a:ext>
+                      </a:extLst>
+                    </a:blip>
+                    <a:stretch>
+                      <a:fillRect/>
+                    </a:stretch>
+                  </pic:blipFill>
+                  <pic:spPr>
+                    <a:xfrm>
+                      <a:off x="0" y="0"/>
+                      <a:ext cx="5731510" cy="3223895"/>
+                    </a:xfrm>
+                    <a:prstGeom prst="rect">
+                      <a:avLst/>
+                    </a:prstGeom>
+                  </pic:spPr>
+                </pic:pic>
+              </a:graphicData>
+            </a:graphic>
+          </wp:inline>
+        </w:drawing>
+      </w:r>
+    </w:p>
+    <w:p/>
+    <w:p>
+      <w:r>
+        <w:lastRenderedPageBreak/>
+        <w:t>Used the terminal command git push to push files from the local repository to the GitHub repository.</w:t>
+      </w:r>
+    </w:p>
+    <w:p>
+      <w:r>
+        <w:rPr>
+          <w:noProof/>
+        </w:rPr>
+        <w:drawing>
+          <wp:inline distT="0" distB="0" distL="0" distR="0" wp14:anchorId="438AD135" wp14:editId="5586D7E2">
+            <wp:extent cx="5731510" cy="3223895"/>
+            <wp:effectExtent l="0" t="0" r="2540" b="0"/>
+            <wp:docPr id="1804416812" name="Picture 7"/>
+            <wp:cNvGraphicFramePr>
+              <a:graphicFrameLocks xmlns:a="http://schemas.openxmlformats.org/drawingml/2006/main" noChangeAspect="1"/>
+            </wp:cNvGraphicFramePr>
+            <a:graphic xmlns:a="http://schemas.openxmlformats.org/drawingml/2006/main">
+              <a:graphicData uri="http://schemas.openxmlformats.org/drawingml/2006/picture">
+                <pic:pic xmlns:pic="http://schemas.openxmlformats.org/drawingml/2006/picture">
+                  <pic:nvPicPr>
+                    <pic:cNvPr id="1804416812" name="Picture 1804416812"/>
+                    <pic:cNvPicPr/>
+                  </pic:nvPicPr>
+                  <pic:blipFill>
+                    <a:blip r:embed="rId10" cstate="print">
+                      <a:extLst>
+                        <a:ext uri="{28A0092B-C50C-407E-A947-70E740481C1C}">
+                          <a14:useLocalDpi xmlns:a14="http://schemas.microsoft.com/office/drawing/2010/main" val="0"/>
+                        </a:ext>
+                      </a:extLst>
+                    </a:blip>
+                    <a:stretch>
+                      <a:fillRect/>
+                    </a:stretch>
+                  </pic:blipFill>
+                  <pic:spPr>
+                    <a:xfrm>
+                      <a:off x="0" y="0"/>
+                      <a:ext cx="5731510" cy="3223895"/>
+                    </a:xfrm>
+                    <a:prstGeom prst="rect">
+                      <a:avLst/>
+                    </a:prstGeom>
+                  </pic:spPr>
+                </pic:pic>
+              </a:graphicData>
+            </a:graphic>
+          </wp:inline>
+        </w:drawing>
+      </w:r>
+    </w:p>
+    <w:p/>
+    <w:p>
+      <w:r>
+        <w:t xml:space="preserve">Created the styles.css file in the </w:t>
+      </w:r>
+      <w:proofErr w:type="spellStart"/>
+      <w:r>
+        <w:t>ArchOSC</w:t>
+      </w:r>
+      <w:proofErr w:type="spellEnd"/>
+      <w:r>
+        <w:t xml:space="preserve"> Assignment folder. Changed background and text colours and added h2 text by editing the index.html and styles.css files.</w:t>
+      </w:r>
+    </w:p>
+    <w:p>
+      <w:r>
+        <w:rPr>
+          <w:noProof/>
+        </w:rPr>
+        <w:drawing>
+          <wp:inline distT="0" distB="0" distL="0" distR="0" wp14:anchorId="26117A4D" wp14:editId="5F371973">
+            <wp:extent cx="5731510" cy="3223895"/>
+            <wp:effectExtent l="0" t="0" r="2540" b="0"/>
+            <wp:docPr id="1223958465" name="Picture 8"/>
+            <wp:cNvGraphicFramePr>
+              <a:graphicFrameLocks xmlns:a="http://schemas.openxmlformats.org/drawingml/2006/main" noChangeAspect="1"/>
+            </wp:cNvGraphicFramePr>
+            <a:graphic xmlns:a="http://schemas.openxmlformats.org/drawingml/2006/main">
+              <a:graphicData uri="http://schemas.openxmlformats.org/drawingml/2006/picture">
+                <pic:pic xmlns:pic="http://schemas.openxmlformats.org/drawingml/2006/picture">
+                  <pic:nvPicPr>
+                    <pic:cNvPr id="1223958465" name="Picture 1223958465"/>
+                    <pic:cNvPicPr/>
+                  </pic:nvPicPr>
+                  <pic:blipFill>
+                    <a:blip r:embed="rId11" cstate="print">
+                      <a:extLst>
+                        <a:ext uri="{28A0092B-C50C-407E-A947-70E740481C1C}">
+                          <a14:useLocalDpi xmlns:a14="http://schemas.microsoft.com/office/drawing/2010/main" val="0"/>
+                        </a:ext>
+                      </a:extLst>
+                    </a:blip>
+                    <a:stretch>
+                      <a:fillRect/>
+                    </a:stretch>
+                  </pic:blipFill>
+                  <pic:spPr>
+                    <a:xfrm>
+                      <a:off x="0" y="0"/>
+                      <a:ext cx="5731510" cy="3223895"/>
+                    </a:xfrm>
+                    <a:prstGeom prst="rect">
+                      <a:avLst/>
+                    </a:prstGeom>
+                  </pic:spPr>
+                </pic:pic>
+              </a:graphicData>
+            </a:graphic>
+          </wp:inline>
+        </w:drawing>
+      </w:r>
+    </w:p>
+    <w:p/>
+    <w:p>
+      <w:r>
+        <w:t xml:space="preserve">Used the terminal commands git status, git </w:t>
+      </w:r>
+      <w:proofErr w:type="gramStart"/>
+      <w:r>
+        <w:t>add .</w:t>
+      </w:r>
+      <w:proofErr w:type="gramEnd"/>
+      <w:r>
+        <w:t xml:space="preserve"> </w:t>
+      </w:r>
+      <w:r>
+        <w:t>,</w:t>
+      </w:r>
+      <w:r>
+        <w:t xml:space="preserve"> git commit -m</w:t>
+      </w:r>
+      <w:r>
+        <w:t xml:space="preserve"> and git push to add the changed detailed above to the GitHub repository from the local repository.</w:t>
+      </w:r>
+    </w:p>
+    <w:p>
+      <w:r>
+        <w:rPr>
+          <w:noProof/>
+        </w:rPr>
+        <w:lastRenderedPageBreak/>
+        <w:drawing>
+          <wp:inline distT="0" distB="0" distL="0" distR="0" wp14:anchorId="1A6AE158" wp14:editId="3D6F9C14">
+            <wp:extent cx="5731510" cy="3223895"/>
+            <wp:effectExtent l="0" t="0" r="2540" b="0"/>
+            <wp:docPr id="1803966960" name="Picture 9"/>
+            <wp:cNvGraphicFramePr>
+              <a:graphicFrameLocks xmlns:a="http://schemas.openxmlformats.org/drawingml/2006/main" noChangeAspect="1"/>
+            </wp:cNvGraphicFramePr>
+            <a:graphic xmlns:a="http://schemas.openxmlformats.org/drawingml/2006/main">
+              <a:graphicData uri="http://schemas.openxmlformats.org/drawingml/2006/picture">
+                <pic:pic xmlns:pic="http://schemas.openxmlformats.org/drawingml/2006/picture">
+                  <pic:nvPicPr>
+                    <pic:cNvPr id="1803966960" name="Picture 1803966960"/>
+                    <pic:cNvPicPr/>
+                  </pic:nvPicPr>
+                  <pic:blipFill>
+                    <a:blip r:embed="rId12" cstate="print">
+                      <a:extLst>
+                        <a:ext uri="{28A0092B-C50C-407E-A947-70E740481C1C}">
+                          <a14:useLocalDpi xmlns:a14="http://schemas.microsoft.com/office/drawing/2010/main" val="0"/>
+                        </a:ext>
+                      </a:extLst>
+                    </a:blip>
+                    <a:stretch>
+                      <a:fillRect/>
+                    </a:stretch>
+                  </pic:blipFill>
+                  <pic:spPr>
+                    <a:xfrm>
+                      <a:off x="0" y="0"/>
+                      <a:ext cx="5731510" cy="3223895"/>
+                    </a:xfrm>
+                    <a:prstGeom prst="rect">
+                      <a:avLst/>
+                    </a:prstGeom>
+                  </pic:spPr>
+                </pic:pic>
+              </a:graphicData>
+            </a:graphic>
+          </wp:inline>
+        </w:drawing>
+      </w:r>
+    </w:p>
+    <w:p/>
+    <w:p>
+      <w:r>
+        <w:t>Used the GitHub website to deploy the main branch of the GitHub repository to GitHub pages.</w:t>
+      </w:r>
+    </w:p>
+    <w:p>
+      <w:r>
+        <w:rPr>
+          <w:noProof/>
+        </w:rPr>
+        <w:drawing>
+          <wp:inline distT="0" distB="0" distL="0" distR="0" wp14:anchorId="41B0A770" wp14:editId="75EA6D4A">
+            <wp:extent cx="5731510" cy="3223895"/>
+            <wp:effectExtent l="0" t="0" r="2540" b="0"/>
+            <wp:docPr id="1240799949" name="Picture 10"/>
+            <wp:cNvGraphicFramePr>
+              <a:graphicFrameLocks xmlns:a="http://schemas.openxmlformats.org/drawingml/2006/main" noChangeAspect="1"/>
+            </wp:cNvGraphicFramePr>
+            <a:graphic xmlns:a="http://schemas.openxmlformats.org/drawingml/2006/main">
+              <a:graphicData uri="http://schemas.openxmlformats.org/drawingml/2006/picture">
+                <pic:pic xmlns:pic="http://schemas.openxmlformats.org/drawingml/2006/picture">
+                  <pic:nvPicPr>
+                    <pic:cNvPr id="1240799949" name="Picture 1240799949"/>
+                    <pic:cNvPicPr/>
+                  </pic:nvPicPr>
+                  <pic:blipFill>
+                    <a:blip r:embed="rId13" cstate="print">
                       <a:extLst>
                         <a:ext uri="{28A0092B-C50C-407E-A947-70E740481C1C}">
                           <a14:useLocalDpi xmlns:a14="http://schemas.microsoft.com/office/drawing/2010/main" val="0"/>

</xml_diff>